<commit_message>
Use English CV for both languages and add advisor and TA details
</commit_message>
<xml_diff>
--- a/cv - english.docx
+++ b/cv - english.docx
@@ -164,7 +164,7 @@
         <w:t>Optimization and Financial Engineering Lab</w:t>
       </w:r>
       <w:r>
-        <w:t xml:space="preserve"> advised by Prof Byung-</w:t>
+        <w:t xml:space="preserve"> (advisor: Prof Byung-</w:t>
       </w:r>
       <w:proofErr w:type="spellStart"/>
       <w:r>
@@ -172,7 +172,7 @@
       </w:r>
       <w:proofErr w:type="spellEnd"/>
       <w:r>
-        <w:t xml:space="preserve"> Moon</w:t>
+        <w:t xml:space="preserve"> Moon)</w:t>
       </w:r>
     </w:p>
     <w:p>
@@ -226,6 +226,9 @@
       </w:pPr>
       <w:r>
         <w:t>Optimization and Financial Engineering Lab</w:t>
+      </w:r>
+      <w:r>
+        <w:t xml:space="preserve"> (advisor: Prof Byung-ro Moon)</w:t>
       </w:r>
     </w:p>
     <w:p>
@@ -486,58 +489,11 @@
       </w:pPr>
       <w:r>
         <w:rPr>
-          <w:b/>
-        </w:rPr>
-        <w:t>Republic of Korea Air Force</w:t>
+          <w:i/>
+        </w:rPr>
+        <w:t>Head Teaching Assistant, Seoul National University</w:t>
         <w:tab/>
-        <w:t>Republic of Korea</w:t>
-      </w:r>
-    </w:p>
-    <w:p>
-      <w:pPr>
-        <w:pStyle w:val="ResumeAlignRight"/>
-        <w:tabs>
-          <w:tab w:val="left" w:pos="360"/>
-        </w:tabs>
-      </w:pPr>
-      <w:r>
-        <w:rPr>
-          <w:i/>
-        </w:rPr>
-        <w:t>Interpretation Officer</w:t>
-        <w:tab/>
-        <w:t>June 2019 – May 2022</w:t>
-      </w:r>
-    </w:p>
-    <w:p>
-      <w:pPr>
-        <w:pStyle w:val="ResumeAlignRight"/>
-        <w:tabs>
-          <w:tab w:val="left" w:pos="360"/>
-        </w:tabs>
-        <w:rPr>
-          <w:b/>
-        </w:rPr>
-      </w:pPr>
-    </w:p>
-    <w:p>
-      <w:pPr>
-        <w:pStyle w:val="ResumeAlignRight"/>
-        <w:pBdr>
-          <w:bottom w:val="single" w:sz="4" w:space="1" w:color="auto"/>
-        </w:pBdr>
-        <w:tabs>
-          <w:tab w:val="left" w:pos="360"/>
-        </w:tabs>
-        <w:rPr>
-          <w:b/>
-        </w:rPr>
-      </w:pPr>
-      <w:r>
-        <w:rPr>
-          <w:b/>
-        </w:rPr>
-        <w:t>PUBLICATIONS</w:t>
+        <w:t>2023–2026</w:t>
       </w:r>
     </w:p>
     <w:p>
@@ -551,11 +507,10 @@
           <w:tab w:val="clear" w:pos="4584"/>
           <w:tab w:val="num" w:pos="360"/>
         </w:tabs>
-        <w:spacing w:after="100"/>
         <w:ind w:left="360"/>
       </w:pPr>
       <w:r>
-        <w:t>H. J. Byun, J. Huh, J. Yook, and B.-R. Moon. Multi-Objective Evolution of Patch Tokens for Tabular Transformers. GECCO 2026.</w:t>
+        <w:t>Data Structures: Spring 2023, Fall 2024 and 2025; Algorithms: Fall 2023, Spring 2025 and 2026.</w:t>
       </w:r>
     </w:p>
     <w:p>
@@ -569,11 +524,73 @@
           <w:tab w:val="clear" w:pos="4584"/>
           <w:tab w:val="num" w:pos="360"/>
         </w:tabs>
-        <w:spacing w:after="100"/>
         <w:ind w:left="360"/>
       </w:pPr>
       <w:r>
-        <w:t>H. J. Byun, J. Yook, H. Koo, and B.-R. Moon. Evolutionary Feature Construction for Tabular Transformers via Gradient-Enhanced Attention Rollout. GECCO 2026 Companion.</w:t>
+        <w:t>Prepared course materials, supported students, coordinated TAs, and graded coursework and exams.</w:t>
+      </w:r>
+    </w:p>
+    <w:p>
+      <w:pPr>
+        <w:pStyle w:val="ResumeAlignRight"/>
+        <w:tabs>
+          <w:tab w:val="left" w:pos="360"/>
+        </w:tabs>
+      </w:pPr>
+      <w:r>
+        <w:rPr>
+          <w:b/>
+        </w:rPr>
+        <w:t>Republic of Korea Air Force</w:t>
+        <w:tab/>
+        <w:t>Republic of Korea</w:t>
+      </w:r>
+    </w:p>
+    <w:p>
+      <w:pPr>
+        <w:pStyle w:val="ResumeAlignRight"/>
+        <w:tabs>
+          <w:tab w:val="left" w:pos="360"/>
+        </w:tabs>
+      </w:pPr>
+      <w:r>
+        <w:rPr>
+          <w:i/>
+        </w:rPr>
+        <w:t>Interpretation Officer</w:t>
+        <w:tab/>
+        <w:t>June 2019 – May 2022</w:t>
+      </w:r>
+    </w:p>
+    <w:p>
+      <w:pPr>
+        <w:pStyle w:val="ResumeAlignRight"/>
+        <w:tabs>
+          <w:tab w:val="left" w:pos="360"/>
+        </w:tabs>
+        <w:rPr>
+          <w:b/>
+        </w:rPr>
+      </w:pPr>
+    </w:p>
+    <w:p>
+      <w:pPr>
+        <w:pStyle w:val="ResumeAlignRight"/>
+        <w:pBdr>
+          <w:bottom w:val="single" w:sz="4" w:space="1" w:color="auto"/>
+        </w:pBdr>
+        <w:tabs>
+          <w:tab w:val="left" w:pos="360"/>
+        </w:tabs>
+        <w:rPr>
+          <w:b/>
+        </w:rPr>
+      </w:pPr>
+      <w:r>
+        <w:rPr>
+          <w:b/>
+        </w:rPr>
+        <w:t>PUBLICATIONS</w:t>
       </w:r>
     </w:p>
     <w:p>
@@ -587,11 +604,11 @@
           <w:tab w:val="clear" w:pos="4584"/>
           <w:tab w:val="num" w:pos="360"/>
         </w:tabs>
-        <w:spacing w:after="100"/>
+        <w:spacing w:after="40"/>
         <w:ind w:left="360"/>
       </w:pPr>
       <w:r>
-        <w:t>J. Yook, J. Seo, J. Huh, H. J. Byun, and B.-R. Moon. CycleFormer: TSP Solver Based on Language Modeling. arXiv:2405.20042 (preprint).</w:t>
+        <w:t>H. J. Byun, J. Huh, J. Yook, and B.-R. Moon. Multi-Objective Evolution of Patch Tokens for Tabular Transformers. GECCO 2026.</w:t>
       </w:r>
     </w:p>
     <w:p>
@@ -605,11 +622,11 @@
           <w:tab w:val="clear" w:pos="4584"/>
           <w:tab w:val="num" w:pos="360"/>
         </w:tabs>
-        <w:spacing w:after="100"/>
+        <w:spacing w:after="40"/>
         <w:ind w:left="360"/>
       </w:pPr>
       <w:r>
-        <w:t>H. H. Cho, H. J. Byun, M. K. Kim, J. Huh, and B.-R. Moon. Evolutionary Pruning of Deep Convolutional Networks by a Memetic GA with Sped-Up Local Optimization and GLCM Energy Z-Score. GECCO 2023 Companion.</w:t>
+        <w:t>H. J. Byun, J. Yook, H. Koo, and B.-R. Moon. Evolutionary Feature Construction for Tabular Transformers via Gradient-Enhanced Attention Rollout. GECCO 2026 Companion.</w:t>
       </w:r>
     </w:p>
     <w:p>
@@ -623,11 +640,11 @@
           <w:tab w:val="clear" w:pos="4584"/>
           <w:tab w:val="num" w:pos="360"/>
         </w:tabs>
-        <w:spacing w:after="100"/>
+        <w:spacing w:after="40"/>
         <w:ind w:left="360"/>
       </w:pPr>
       <w:r>
-        <w:t>H. Koo*, H. J. Byun*, and B.-R. Moon. RTSC: Return-Aware Token-Space Contrastive Transformer for Cross-Sectional Stock Return Prediction. ICAIF 2026, under review (*equal contribution).</w:t>
+        <w:t>J. Yook, J. Seo, J. Huh, H. J. Byun, and B.-R. Moon. CycleFormer: TSP Solver Based on Language Modeling. arXiv:2405.20042 (preprint).</w:t>
       </w:r>
     </w:p>
     <w:p>
@@ -641,7 +658,43 @@
           <w:tab w:val="clear" w:pos="4584"/>
           <w:tab w:val="num" w:pos="360"/>
         </w:tabs>
-        <w:spacing w:after="100"/>
+        <w:spacing w:after="40"/>
+        <w:ind w:left="360"/>
+      </w:pPr>
+      <w:r>
+        <w:t>H. H. Cho, H. J. Byun, M. K. Kim, J. Huh, and B.-R. Moon. Evolutionary Pruning of Deep Convolutional Networks by a Memetic GA with Sped-Up Local Optimization and GLCM Energy Z-Score. GECCO 2023 Companion.</w:t>
+      </w:r>
+    </w:p>
+    <w:p>
+      <w:pPr>
+        <w:pStyle w:val="ResumeAlignRight"/>
+        <w:numPr>
+          <w:ilvl w:val="0"/>
+          <w:numId w:val="2"/>
+        </w:numPr>
+        <w:tabs>
+          <w:tab w:val="clear" w:pos="4584"/>
+          <w:tab w:val="num" w:pos="360"/>
+        </w:tabs>
+        <w:spacing w:after="40"/>
+        <w:ind w:left="360"/>
+      </w:pPr>
+      <w:r>
+        <w:t>H. Koo*, H. J. Byun*, and B.-R. Moon. RTSC: Return-Aware Token-Space Contrastive Transformer for Cross-Sectional Stock Return Prediction. ICAIF 2026, under review (*equal contribution).</w:t>
+      </w:r>
+    </w:p>
+    <w:p>
+      <w:pPr>
+        <w:pStyle w:val="ResumeAlignRight"/>
+        <w:numPr>
+          <w:ilvl w:val="0"/>
+          <w:numId w:val="2"/>
+        </w:numPr>
+        <w:tabs>
+          <w:tab w:val="clear" w:pos="4584"/>
+          <w:tab w:val="num" w:pos="360"/>
+        </w:tabs>
+        <w:spacing w:after="40"/>
         <w:ind w:left="360"/>
       </w:pPr>
       <w:r>

</xml_diff>